<commit_message>
Publish Algorithm 1 synthetic 1000 benchmark
</commit_message>
<xml_diff>
--- a/算法1技术路线详细报告_1000合成测试版.docx
+++ b/算法1技术路线详细报告_1000合成测试版.docx
@@ -8,7 +8,7 @@
         <w:jc w:val="center"/>
       </w:pPr>
       <w:r>
-        <w:t>算法一技术路线详细报告</w:t>
+        <w:t>算法一技术路线与课程评测报告</w:t>
       </w:r>
     </w:p>
     <w:p>
@@ -26,7 +26,7 @@
     </w:p>
     <w:p>
       <w:r>
-        <w:t>本报告依据原技术路线文档重写，结果入口已切换为当前协议固定但非预注册的 1,000 条合成 benchmark。</w:t>
+        <w:t>本报告沿用算法一技术路线的章节和评测口径，结果入口为当前协议生成的 1,000 条合成 benchmark。</w:t>
       </w:r>
     </w:p>
     <w:p>
@@ -83,12 +83,12 @@
         <w:jc w:val="center"/>
         <w:tblLook w:firstColumn="1" w:firstRow="1" w:lastColumn="0" w:lastRow="0" w:noHBand="0" w:noVBand="1" w:val="04A0"/>
         <w:tblBorders>
-          <w:top w:val="single" w:sz="6" w:color="D9D9D9"/>
-          <w:left w:val="single" w:sz="6" w:color="D9D9D9"/>
-          <w:bottom w:val="single" w:sz="6" w:color="D9D9D9"/>
-          <w:right w:val="single" w:sz="6" w:color="D9D9D9"/>
-          <w:insideH w:val="single" w:sz="6" w:color="D9D9D9"/>
-          <w:insideV w:val="single" w:sz="6" w:color="D9D9D9"/>
+          <w:top w:val="single" w:sz="6" w:color="CBCDD1"/>
+          <w:left w:val="single" w:sz="6" w:color="CBCDD1"/>
+          <w:bottom w:val="single" w:sz="6" w:color="CBCDD1"/>
+          <w:right w:val="single" w:sz="6" w:color="CBCDD1"/>
+          <w:insideH w:val="single" w:sz="6" w:color="CBCDD1"/>
+          <w:insideV w:val="single" w:sz="6" w:color="CBCDD1"/>
         </w:tblBorders>
       </w:tblPr>
       <w:tblGrid>
@@ -97,11 +97,14 @@
         <w:gridCol w:w="3312"/>
       </w:tblGrid>
       <w:tr>
+        <w:trPr>
+          <w:tblHeader w:val="true"/>
+        </w:trPr>
         <w:tc>
           <w:tcPr>
-            <w:tcW w:type="dxa" w:w="1440"/>
+            <w:tcW w:type="dxa" w:w="1368"/>
             <w:vAlign w:val="center"/>
-            <w:shd w:fill="1F4E78"/>
+            <w:shd w:fill="F2F4F7"/>
           </w:tcPr>
           <w:p>
             <w:pPr>
@@ -111,7 +114,7 @@
             <w:r>
               <w:rPr>
                 <w:b/>
-                <w:color w:val="FFFFFF"/>
+                <w:color w:val="000000"/>
                 <w:sz w:val="18"/>
               </w:rPr>
               <w:t>字段</w:t>
@@ -120,9 +123,9 @@
         </w:tc>
         <w:tc>
           <w:tcPr>
-            <w:tcW w:type="dxa" w:w="4608"/>
+            <w:tcW w:type="dxa" w:w="3528"/>
             <w:vAlign w:val="center"/>
-            <w:shd w:fill="1F4E78"/>
+            <w:shd w:fill="F2F4F7"/>
           </w:tcPr>
           <w:p>
             <w:pPr>
@@ -132,7 +135,7 @@
             <w:r>
               <w:rPr>
                 <w:b/>
-                <w:color w:val="FFFFFF"/>
+                <w:color w:val="000000"/>
                 <w:sz w:val="18"/>
               </w:rPr>
               <w:t>投影规则</w:t>
@@ -141,9 +144,9 @@
         </w:tc>
         <w:tc>
           <w:tcPr>
-            <w:tcW w:type="dxa" w:w="3744"/>
+            <w:tcW w:type="dxa" w:w="3413"/>
             <w:vAlign w:val="center"/>
-            <w:shd w:fill="1F4E78"/>
+            <w:shd w:fill="F2F4F7"/>
           </w:tcPr>
           <w:p>
             <w:pPr>
@@ -153,7 +156,7 @@
             <w:r>
               <w:rPr>
                 <w:b/>
-                <w:color w:val="FFFFFF"/>
+                <w:color w:val="000000"/>
                 <w:sz w:val="18"/>
               </w:rPr>
               <w:t>缺失处理</w:t>
@@ -164,7 +167,7 @@
       <w:tr>
         <w:tc>
           <w:tcPr>
-            <w:tcW w:type="dxa" w:w="1440"/>
+            <w:tcW w:type="dxa" w:w="1368"/>
             <w:vAlign w:val="center"/>
           </w:tcPr>
           <w:p>
@@ -184,7 +187,7 @@
         </w:tc>
         <w:tc>
           <w:tcPr>
-            <w:tcW w:type="dxa" w:w="4608"/>
+            <w:tcW w:type="dxa" w:w="3528"/>
             <w:vAlign w:val="center"/>
           </w:tcPr>
           <w:p>
@@ -204,7 +207,7 @@
         </w:tc>
         <w:tc>
           <w:tcPr>
-            <w:tcW w:type="dxa" w:w="3744"/>
+            <w:tcW w:type="dxa" w:w="3413"/>
             <w:vAlign w:val="center"/>
           </w:tcPr>
           <w:p>
@@ -226,7 +229,7 @@
       <w:tr>
         <w:tc>
           <w:tcPr>
-            <w:tcW w:type="dxa" w:w="1440"/>
+            <w:tcW w:type="dxa" w:w="1368"/>
             <w:vAlign w:val="center"/>
             <w:shd w:fill="F3F6F9"/>
           </w:tcPr>
@@ -247,7 +250,7 @@
         </w:tc>
         <w:tc>
           <w:tcPr>
-            <w:tcW w:type="dxa" w:w="4608"/>
+            <w:tcW w:type="dxa" w:w="3528"/>
             <w:vAlign w:val="center"/>
             <w:shd w:fill="F3F6F9"/>
           </w:tcPr>
@@ -268,7 +271,7 @@
         </w:tc>
         <w:tc>
           <w:tcPr>
-            <w:tcW w:type="dxa" w:w="3744"/>
+            <w:tcW w:type="dxa" w:w="3413"/>
             <w:vAlign w:val="center"/>
             <w:shd w:fill="F3F6F9"/>
           </w:tcPr>
@@ -291,7 +294,7 @@
       <w:tr>
         <w:tc>
           <w:tcPr>
-            <w:tcW w:type="dxa" w:w="1440"/>
+            <w:tcW w:type="dxa" w:w="1368"/>
             <w:vAlign w:val="center"/>
           </w:tcPr>
           <w:p>
@@ -311,7 +314,7 @@
         </w:tc>
         <w:tc>
           <w:tcPr>
-            <w:tcW w:type="dxa" w:w="4608"/>
+            <w:tcW w:type="dxa" w:w="3528"/>
             <w:vAlign w:val="center"/>
           </w:tcPr>
           <w:p>
@@ -331,7 +334,7 @@
         </w:tc>
         <w:tc>
           <w:tcPr>
-            <w:tcW w:type="dxa" w:w="3744"/>
+            <w:tcW w:type="dxa" w:w="3413"/>
             <w:vAlign w:val="center"/>
           </w:tcPr>
           <w:p>
@@ -353,7 +356,7 @@
       <w:tr>
         <w:tc>
           <w:tcPr>
-            <w:tcW w:type="dxa" w:w="1440"/>
+            <w:tcW w:type="dxa" w:w="1368"/>
             <w:vAlign w:val="center"/>
             <w:shd w:fill="F3F6F9"/>
           </w:tcPr>
@@ -374,7 +377,7 @@
         </w:tc>
         <w:tc>
           <w:tcPr>
-            <w:tcW w:type="dxa" w:w="4608"/>
+            <w:tcW w:type="dxa" w:w="3528"/>
             <w:vAlign w:val="center"/>
             <w:shd w:fill="F3F6F9"/>
           </w:tcPr>
@@ -395,7 +398,7 @@
         </w:tc>
         <w:tc>
           <w:tcPr>
-            <w:tcW w:type="dxa" w:w="3744"/>
+            <w:tcW w:type="dxa" w:w="3413"/>
             <w:vAlign w:val="center"/>
             <w:shd w:fill="F3F6F9"/>
           </w:tcPr>
@@ -418,7 +421,7 @@
       <w:tr>
         <w:tc>
           <w:tcPr>
-            <w:tcW w:type="dxa" w:w="1440"/>
+            <w:tcW w:type="dxa" w:w="1368"/>
             <w:vAlign w:val="center"/>
           </w:tcPr>
           <w:p>
@@ -438,7 +441,7 @@
         </w:tc>
         <w:tc>
           <w:tcPr>
-            <w:tcW w:type="dxa" w:w="4608"/>
+            <w:tcW w:type="dxa" w:w="3528"/>
             <w:vAlign w:val="center"/>
           </w:tcPr>
           <w:p>
@@ -458,7 +461,7 @@
         </w:tc>
         <w:tc>
           <w:tcPr>
-            <w:tcW w:type="dxa" w:w="3744"/>
+            <w:tcW w:type="dxa" w:w="3413"/>
             <w:vAlign w:val="center"/>
           </w:tcPr>
           <w:p>
@@ -593,12 +596,12 @@
         <w:jc w:val="center"/>
         <w:tblLook w:firstColumn="1" w:firstRow="1" w:lastColumn="0" w:lastRow="0" w:noHBand="0" w:noVBand="1" w:val="04A0"/>
         <w:tblBorders>
-          <w:top w:val="single" w:sz="6" w:color="D9D9D9"/>
-          <w:left w:val="single" w:sz="6" w:color="D9D9D9"/>
-          <w:bottom w:val="single" w:sz="6" w:color="D9D9D9"/>
-          <w:right w:val="single" w:sz="6" w:color="D9D9D9"/>
-          <w:insideH w:val="single" w:sz="6" w:color="D9D9D9"/>
-          <w:insideV w:val="single" w:sz="6" w:color="D9D9D9"/>
+          <w:top w:val="single" w:sz="6" w:color="CBCDD1"/>
+          <w:left w:val="single" w:sz="6" w:color="CBCDD1"/>
+          <w:bottom w:val="single" w:sz="6" w:color="CBCDD1"/>
+          <w:right w:val="single" w:sz="6" w:color="CBCDD1"/>
+          <w:insideH w:val="single" w:sz="6" w:color="CBCDD1"/>
+          <w:insideV w:val="single" w:sz="6" w:color="CBCDD1"/>
         </w:tblBorders>
       </w:tblPr>
       <w:tblGrid>
@@ -607,11 +610,14 @@
         <w:gridCol w:w="3312"/>
       </w:tblGrid>
       <w:tr>
+        <w:trPr>
+          <w:tblHeader w:val="true"/>
+        </w:trPr>
         <w:tc>
           <w:tcPr>
-            <w:tcW w:type="dxa" w:w="1728"/>
+            <w:tcW w:type="dxa" w:w="1512"/>
             <w:vAlign w:val="center"/>
-            <w:shd w:fill="1F4E78"/>
+            <w:shd w:fill="F2F4F7"/>
           </w:tcPr>
           <w:p>
             <w:pPr>
@@ -621,7 +627,7 @@
             <w:r>
               <w:rPr>
                 <w:b/>
-                <w:color w:val="FFFFFF"/>
+                <w:color w:val="000000"/>
                 <w:sz w:val="18"/>
               </w:rPr>
               <w:t>指标</w:t>
@@ -630,9 +636,9 @@
         </w:tc>
         <w:tc>
           <w:tcPr>
-            <w:tcW w:type="dxa" w:w="4320"/>
+            <w:tcW w:type="dxa" w:w="3528"/>
             <w:vAlign w:val="center"/>
-            <w:shd w:fill="1F4E78"/>
+            <w:shd w:fill="F2F4F7"/>
           </w:tcPr>
           <w:p>
             <w:pPr>
@@ -642,7 +648,7 @@
             <w:r>
               <w:rPr>
                 <w:b/>
-                <w:color w:val="FFFFFF"/>
+                <w:color w:val="000000"/>
                 <w:sz w:val="18"/>
               </w:rPr>
               <w:t>定义</w:t>
@@ -651,9 +657,9 @@
         </w:tc>
         <w:tc>
           <w:tcPr>
-            <w:tcW w:type="dxa" w:w="3744"/>
+            <w:tcW w:type="dxa" w:w="3269"/>
             <w:vAlign w:val="center"/>
-            <w:shd w:fill="1F4E78"/>
+            <w:shd w:fill="F2F4F7"/>
           </w:tcPr>
           <w:p>
             <w:pPr>
@@ -663,7 +669,7 @@
             <w:r>
               <w:rPr>
                 <w:b/>
-                <w:color w:val="FFFFFF"/>
+                <w:color w:val="000000"/>
                 <w:sz w:val="18"/>
               </w:rPr>
               <w:t>解释</w:t>
@@ -674,7 +680,7 @@
       <w:tr>
         <w:tc>
           <w:tcPr>
-            <w:tcW w:type="dxa" w:w="1728"/>
+            <w:tcW w:type="dxa" w:w="1512"/>
             <w:vAlign w:val="center"/>
           </w:tcPr>
           <w:p>
@@ -694,7 +700,7 @@
         </w:tc>
         <w:tc>
           <w:tcPr>
-            <w:tcW w:type="dxa" w:w="4320"/>
+            <w:tcW w:type="dxa" w:w="3528"/>
             <w:vAlign w:val="center"/>
           </w:tcPr>
           <w:p>
@@ -714,7 +720,7 @@
         </w:tc>
         <w:tc>
           <w:tcPr>
-            <w:tcW w:type="dxa" w:w="3744"/>
+            <w:tcW w:type="dxa" w:w="3269"/>
             <w:vAlign w:val="center"/>
           </w:tcPr>
           <w:p>
@@ -736,7 +742,7 @@
       <w:tr>
         <w:tc>
           <w:tcPr>
-            <w:tcW w:type="dxa" w:w="1728"/>
+            <w:tcW w:type="dxa" w:w="1512"/>
             <w:vAlign w:val="center"/>
             <w:shd w:fill="F3F6F9"/>
           </w:tcPr>
@@ -757,7 +763,7 @@
         </w:tc>
         <w:tc>
           <w:tcPr>
-            <w:tcW w:type="dxa" w:w="4320"/>
+            <w:tcW w:type="dxa" w:w="3528"/>
             <w:vAlign w:val="center"/>
             <w:shd w:fill="F3F6F9"/>
           </w:tcPr>
@@ -778,7 +784,7 @@
         </w:tc>
         <w:tc>
           <w:tcPr>
-            <w:tcW w:type="dxa" w:w="3744"/>
+            <w:tcW w:type="dxa" w:w="3269"/>
             <w:vAlign w:val="center"/>
             <w:shd w:fill="F3F6F9"/>
           </w:tcPr>
@@ -801,7 +807,7 @@
       <w:tr>
         <w:tc>
           <w:tcPr>
-            <w:tcW w:type="dxa" w:w="1728"/>
+            <w:tcW w:type="dxa" w:w="1512"/>
             <w:vAlign w:val="center"/>
           </w:tcPr>
           <w:p>
@@ -821,7 +827,7 @@
         </w:tc>
         <w:tc>
           <w:tcPr>
-            <w:tcW w:type="dxa" w:w="4320"/>
+            <w:tcW w:type="dxa" w:w="3528"/>
             <w:vAlign w:val="center"/>
           </w:tcPr>
           <w:p>
@@ -841,7 +847,7 @@
         </w:tc>
         <w:tc>
           <w:tcPr>
-            <w:tcW w:type="dxa" w:w="3744"/>
+            <w:tcW w:type="dxa" w:w="3269"/>
             <w:vAlign w:val="center"/>
           </w:tcPr>
           <w:p>
@@ -863,7 +869,7 @@
       <w:tr>
         <w:tc>
           <w:tcPr>
-            <w:tcW w:type="dxa" w:w="1728"/>
+            <w:tcW w:type="dxa" w:w="1512"/>
             <w:vAlign w:val="center"/>
             <w:shd w:fill="F3F6F9"/>
           </w:tcPr>
@@ -884,7 +890,7 @@
         </w:tc>
         <w:tc>
           <w:tcPr>
-            <w:tcW w:type="dxa" w:w="4320"/>
+            <w:tcW w:type="dxa" w:w="3528"/>
             <w:vAlign w:val="center"/>
             <w:shd w:fill="F3F6F9"/>
           </w:tcPr>
@@ -905,7 +911,7 @@
         </w:tc>
         <w:tc>
           <w:tcPr>
-            <w:tcW w:type="dxa" w:w="3744"/>
+            <w:tcW w:type="dxa" w:w="3269"/>
             <w:vAlign w:val="center"/>
             <w:shd w:fill="F3F6F9"/>
           </w:tcPr>
@@ -942,7 +948,7 @@
     </w:p>
     <w:p>
       <w:r>
-        <w:t>四种方法均在同一批 1,000 个合成目标上评测。下表为宏平均；原附件中 22.33% 的数值属于从 234 个 MAL 测试目标中事后挑出的 40 个 showcase 的 coverage@5，不能作为 234 个总体目标的结果。本版本不再把该数值作为发布结果。</w:t>
+        <w:t>四种方法均在同一批 1,000 个合成目标上评测。下表为宏平均，所有方法使用相同的目标、合成真值和 14,201 个候选作品。</w:t>
       </w:r>
     </w:p>
     <w:tbl>
@@ -952,28 +958,32 @@
         <w:jc w:val="center"/>
         <w:tblLook w:firstColumn="1" w:firstRow="1" w:lastColumn="0" w:lastRow="0" w:noHBand="0" w:noVBand="1" w:val="04A0"/>
         <w:tblBorders>
-          <w:top w:val="single" w:sz="6" w:color="D9D9D9"/>
-          <w:left w:val="single" w:sz="6" w:color="D9D9D9"/>
-          <w:bottom w:val="single" w:sz="6" w:color="D9D9D9"/>
-          <w:right w:val="single" w:sz="6" w:color="D9D9D9"/>
-          <w:insideH w:val="single" w:sz="6" w:color="D9D9D9"/>
-          <w:insideV w:val="single" w:sz="6" w:color="D9D9D9"/>
+          <w:top w:val="single" w:sz="6" w:color="CBCDD1"/>
+          <w:left w:val="single" w:sz="6" w:color="CBCDD1"/>
+          <w:bottom w:val="single" w:sz="6" w:color="CBCDD1"/>
+          <w:right w:val="single" w:sz="6" w:color="CBCDD1"/>
+          <w:insideH w:val="single" w:sz="6" w:color="CBCDD1"/>
+          <w:insideV w:val="single" w:sz="6" w:color="CBCDD1"/>
         </w:tblBorders>
       </w:tblPr>
       <w:tblGrid>
-        <w:gridCol w:w="1656"/>
-        <w:gridCol w:w="1656"/>
-        <w:gridCol w:w="1656"/>
-        <w:gridCol w:w="1656"/>
-        <w:gridCol w:w="1656"/>
-        <w:gridCol w:w="1656"/>
+        <w:gridCol w:w="1419"/>
+        <w:gridCol w:w="1419"/>
+        <w:gridCol w:w="1419"/>
+        <w:gridCol w:w="1419"/>
+        <w:gridCol w:w="1419"/>
+        <w:gridCol w:w="1419"/>
+        <w:gridCol w:w="1419"/>
       </w:tblGrid>
       <w:tr>
+        <w:trPr>
+          <w:tblHeader w:val="true"/>
+        </w:trPr>
         <w:tc>
           <w:tcPr>
-            <w:tcW w:type="dxa" w:w="2304"/>
+            <w:tcW w:type="dxa" w:w="648"/>
             <w:vAlign w:val="center"/>
-            <w:shd w:fill="1F4E78"/>
+            <w:shd w:fill="F2F4F7"/>
           </w:tcPr>
           <w:p>
             <w:pPr>
@@ -983,18 +993,18 @@
             <w:r>
               <w:rPr>
                 <w:b/>
-                <w:color w:val="FFFFFF"/>
+                <w:color w:val="000000"/>
                 <w:sz w:val="18"/>
               </w:rPr>
-              <w:t>方法</w:t>
+              <w:t>排名</w:t>
             </w:r>
           </w:p>
         </w:tc>
         <w:tc>
           <w:tcPr>
-            <w:tcW w:type="dxa" w:w="1872"/>
+            <w:tcW w:type="dxa" w:w="2232"/>
             <w:vAlign w:val="center"/>
-            <w:shd w:fill="1F4E78"/>
+            <w:shd w:fill="F2F4F7"/>
           </w:tcPr>
           <w:p>
             <w:pPr>
@@ -1004,7 +1014,49 @@
             <w:r>
               <w:rPr>
                 <w:b/>
-                <w:color w:val="FFFFFF"/>
+                <w:color w:val="000000"/>
+                <w:sz w:val="18"/>
+              </w:rPr>
+              <w:t>方法</w:t>
+            </w:r>
+          </w:p>
+        </w:tc>
+        <w:tc>
+          <w:tcPr>
+            <w:tcW w:type="dxa" w:w="893"/>
+            <w:vAlign w:val="center"/>
+            <w:shd w:fill="F2F4F7"/>
+          </w:tcPr>
+          <w:p>
+            <w:pPr>
+              <w:spacing w:after="40"/>
+            </w:pPr>
+            <w:r/>
+            <w:r>
+              <w:rPr>
+                <w:b/>
+                <w:color w:val="000000"/>
+                <w:sz w:val="18"/>
+              </w:rPr>
+              <w:t>目标数</w:t>
+            </w:r>
+          </w:p>
+        </w:tc>
+        <w:tc>
+          <w:tcPr>
+            <w:tcW w:type="dxa" w:w="1094"/>
+            <w:vAlign w:val="center"/>
+            <w:shd w:fill="F2F4F7"/>
+          </w:tcPr>
+          <w:p>
+            <w:pPr>
+              <w:spacing w:after="40"/>
+            </w:pPr>
+            <w:r/>
+            <w:r>
+              <w:rPr>
+                <w:b/>
+                <w:color w:val="000000"/>
                 <w:sz w:val="18"/>
               </w:rPr>
               <w:t>coverage@5</w:t>
@@ -1015,9 +1067,9 @@
         </w:tc>
         <w:tc>
           <w:tcPr>
-            <w:tcW w:type="dxa" w:w="1440"/>
+            <w:tcW w:type="dxa" w:w="1094"/>
             <w:vAlign w:val="center"/>
-            <w:shd w:fill="1F4E78"/>
+            <w:shd w:fill="F2F4F7"/>
           </w:tcPr>
           <w:p>
             <w:pPr>
@@ -1027,7 +1079,7 @@
             <w:r>
               <w:rPr>
                 <w:b/>
-                <w:color w:val="FFFFFF"/>
+                <w:color w:val="000000"/>
                 <w:sz w:val="18"/>
               </w:rPr>
               <w:t>NDCG@5</w:t>
@@ -1036,9 +1088,9 @@
         </w:tc>
         <w:tc>
           <w:tcPr>
-            <w:tcW w:type="dxa" w:w="1872"/>
+            <w:tcW w:type="dxa" w:w="1094"/>
             <w:vAlign w:val="center"/>
-            <w:shd w:fill="1F4E78"/>
+            <w:shd w:fill="F2F4F7"/>
           </w:tcPr>
           <w:p>
             <w:pPr>
@@ -1048,7 +1100,7 @@
             <w:r>
               <w:rPr>
                 <w:b/>
-                <w:color w:val="FFFFFF"/>
+                <w:color w:val="000000"/>
                 <w:sz w:val="18"/>
               </w:rPr>
               <w:t>hit_rate@5</w:t>
@@ -1059,9 +1111,9 @@
         </w:tc>
         <w:tc>
           <w:tcPr>
-            <w:tcW w:type="dxa" w:w="1584"/>
+            <w:tcW w:type="dxa" w:w="1253"/>
             <w:vAlign w:val="center"/>
-            <w:shd w:fill="1F4E78"/>
+            <w:shd w:fill="F2F4F7"/>
           </w:tcPr>
           <w:p>
             <w:pPr>
@@ -1071,18 +1123,19 @@
             <w:r>
               <w:rPr>
                 <w:b/>
-                <w:color w:val="FFFFFF"/>
+                <w:color w:val="000000"/>
                 <w:sz w:val="18"/>
               </w:rPr>
               <w:t>precision@5</w:t>
             </w:r>
           </w:p>
         </w:tc>
+      </w:tr>
+      <w:tr>
         <w:tc>
           <w:tcPr>
-            <w:tcW w:type="dxa" w:w="1152"/>
+            <w:tcW w:type="dxa" w:w="648"/>
             <w:vAlign w:val="center"/>
-            <w:shd w:fill="1F4E78"/>
           </w:tcPr>
           <w:p>
             <w:pPr>
@@ -1091,19 +1144,17 @@
             <w:r/>
             <w:r>
               <w:rPr>
-                <w:b/>
-                <w:color w:val="FFFFFF"/>
+                <w:b w:val="0"/>
+                <w:color w:val="000000"/>
                 <w:sz w:val="18"/>
               </w:rPr>
-              <w:t>目标数</w:t>
+              <w:t>1</w:t>
             </w:r>
           </w:p>
         </w:tc>
-      </w:tr>
-      <w:tr>
         <w:tc>
           <w:tcPr>
-            <w:tcW w:type="dxa" w:w="2304"/>
+            <w:tcW w:type="dxa" w:w="2232"/>
             <w:vAlign w:val="center"/>
           </w:tcPr>
           <w:p>
@@ -1123,7 +1174,27 @@
         </w:tc>
         <w:tc>
           <w:tcPr>
-            <w:tcW w:type="dxa" w:w="1872"/>
+            <w:tcW w:type="dxa" w:w="893"/>
+            <w:vAlign w:val="center"/>
+          </w:tcPr>
+          <w:p>
+            <w:pPr>
+              <w:spacing w:after="40"/>
+            </w:pPr>
+            <w:r/>
+            <w:r>
+              <w:rPr>
+                <w:b w:val="0"/>
+                <w:color w:val="000000"/>
+                <w:sz w:val="18"/>
+              </w:rPr>
+              <w:t>1,000</w:t>
+            </w:r>
+          </w:p>
+        </w:tc>
+        <w:tc>
+          <w:tcPr>
+            <w:tcW w:type="dxa" w:w="1094"/>
             <w:vAlign w:val="center"/>
           </w:tcPr>
           <w:p>
@@ -1143,7 +1214,7 @@
         </w:tc>
         <w:tc>
           <w:tcPr>
-            <w:tcW w:type="dxa" w:w="1440"/>
+            <w:tcW w:type="dxa" w:w="1094"/>
             <w:vAlign w:val="center"/>
           </w:tcPr>
           <w:p>
@@ -1163,7 +1234,7 @@
         </w:tc>
         <w:tc>
           <w:tcPr>
-            <w:tcW w:type="dxa" w:w="1872"/>
+            <w:tcW w:type="dxa" w:w="1094"/>
             <w:vAlign w:val="center"/>
           </w:tcPr>
           <w:p>
@@ -1183,7 +1254,7 @@
         </w:tc>
         <w:tc>
           <w:tcPr>
-            <w:tcW w:type="dxa" w:w="1584"/>
+            <w:tcW w:type="dxa" w:w="1253"/>
             <w:vAlign w:val="center"/>
           </w:tcPr>
           <w:p>
@@ -1201,31 +1272,11 @@
             </w:r>
           </w:p>
         </w:tc>
-        <w:tc>
-          <w:tcPr>
-            <w:tcW w:type="dxa" w:w="1152"/>
-            <w:vAlign w:val="center"/>
-          </w:tcPr>
-          <w:p>
-            <w:pPr>
-              <w:spacing w:after="40"/>
-            </w:pPr>
-            <w:r/>
-            <w:r>
-              <w:rPr>
-                <w:b w:val="0"/>
-                <w:color w:val="000000"/>
-                <w:sz w:val="18"/>
-              </w:rPr>
-              <w:t>1,000</w:t>
-            </w:r>
-          </w:p>
-        </w:tc>
       </w:tr>
       <w:tr>
         <w:tc>
           <w:tcPr>
-            <w:tcW w:type="dxa" w:w="2304"/>
+            <w:tcW w:type="dxa" w:w="648"/>
             <w:vAlign w:val="center"/>
             <w:shd w:fill="F3F6F9"/>
           </w:tcPr>
@@ -1240,242 +1291,13 @@
                 <w:color w:val="000000"/>
                 <w:sz w:val="18"/>
               </w:rPr>
-              <w:t>B 逻辑回归</w:t>
+              <w:t>2</w:t>
             </w:r>
           </w:p>
         </w:tc>
         <w:tc>
           <w:tcPr>
-            <w:tcW w:type="dxa" w:w="1872"/>
-            <w:vAlign w:val="center"/>
-            <w:shd w:fill="F3F6F9"/>
-          </w:tcPr>
-          <w:p>
-            <w:pPr>
-              <w:spacing w:after="40"/>
-            </w:pPr>
-            <w:r/>
-            <w:r>
-              <w:rPr>
-                <w:b w:val="0"/>
-                <w:color w:val="000000"/>
-                <w:sz w:val="18"/>
-              </w:rPr>
-              <w:t>21.92%</w:t>
-            </w:r>
-          </w:p>
-        </w:tc>
-        <w:tc>
-          <w:tcPr>
-            <w:tcW w:type="dxa" w:w="1440"/>
-            <w:vAlign w:val="center"/>
-            <w:shd w:fill="F3F6F9"/>
-          </w:tcPr>
-          <w:p>
-            <w:pPr>
-              <w:spacing w:after="40"/>
-            </w:pPr>
-            <w:r/>
-            <w:r>
-              <w:rPr>
-                <w:b w:val="0"/>
-                <w:color w:val="000000"/>
-                <w:sz w:val="18"/>
-              </w:rPr>
-              <w:t>0.2371</w:t>
-            </w:r>
-          </w:p>
-        </w:tc>
-        <w:tc>
-          <w:tcPr>
-            <w:tcW w:type="dxa" w:w="1872"/>
-            <w:vAlign w:val="center"/>
-            <w:shd w:fill="F3F6F9"/>
-          </w:tcPr>
-          <w:p>
-            <w:pPr>
-              <w:spacing w:after="40"/>
-            </w:pPr>
-            <w:r/>
-            <w:r>
-              <w:rPr>
-                <w:b w:val="0"/>
-                <w:color w:val="000000"/>
-                <w:sz w:val="18"/>
-              </w:rPr>
-              <w:t>54.90%</w:t>
-            </w:r>
-          </w:p>
-        </w:tc>
-        <w:tc>
-          <w:tcPr>
-            <w:tcW w:type="dxa" w:w="1584"/>
-            <w:vAlign w:val="center"/>
-            <w:shd w:fill="F3F6F9"/>
-          </w:tcPr>
-          <w:p>
-            <w:pPr>
-              <w:spacing w:after="40"/>
-            </w:pPr>
-            <w:r/>
-            <w:r>
-              <w:rPr>
-                <w:b w:val="0"/>
-                <w:color w:val="000000"/>
-                <w:sz w:val="18"/>
-              </w:rPr>
-              <w:t>21.92%</w:t>
-            </w:r>
-          </w:p>
-        </w:tc>
-        <w:tc>
-          <w:tcPr>
-            <w:tcW w:type="dxa" w:w="1152"/>
-            <w:vAlign w:val="center"/>
-            <w:shd w:fill="F3F6F9"/>
-          </w:tcPr>
-          <w:p>
-            <w:pPr>
-              <w:spacing w:after="40"/>
-            </w:pPr>
-            <w:r/>
-            <w:r>
-              <w:rPr>
-                <w:b w:val="0"/>
-                <w:color w:val="000000"/>
-                <w:sz w:val="18"/>
-              </w:rPr>
-              <w:t>1,000</w:t>
-            </w:r>
-          </w:p>
-        </w:tc>
-      </w:tr>
-      <w:tr>
-        <w:tc>
-          <w:tcPr>
-            <w:tcW w:type="dxa" w:w="2304"/>
-            <w:vAlign w:val="center"/>
-          </w:tcPr>
-          <w:p>
-            <w:pPr>
-              <w:spacing w:after="40"/>
-            </w:pPr>
-            <w:r/>
-            <w:r>
-              <w:rPr>
-                <w:b w:val="0"/>
-                <w:color w:val="000000"/>
-                <w:sz w:val="18"/>
-              </w:rPr>
-              <w:t>C BGE 语义</w:t>
-            </w:r>
-          </w:p>
-        </w:tc>
-        <w:tc>
-          <w:tcPr>
-            <w:tcW w:type="dxa" w:w="1872"/>
-            <w:vAlign w:val="center"/>
-          </w:tcPr>
-          <w:p>
-            <w:pPr>
-              <w:spacing w:after="40"/>
-            </w:pPr>
-            <w:r/>
-            <w:r>
-              <w:rPr>
-                <w:b w:val="0"/>
-                <w:color w:val="000000"/>
-                <w:sz w:val="18"/>
-              </w:rPr>
-              <w:t>13.54%</w:t>
-            </w:r>
-          </w:p>
-        </w:tc>
-        <w:tc>
-          <w:tcPr>
-            <w:tcW w:type="dxa" w:w="1440"/>
-            <w:vAlign w:val="center"/>
-          </w:tcPr>
-          <w:p>
-            <w:pPr>
-              <w:spacing w:after="40"/>
-            </w:pPr>
-            <w:r/>
-            <w:r>
-              <w:rPr>
-                <w:b w:val="0"/>
-                <w:color w:val="000000"/>
-                <w:sz w:val="18"/>
-              </w:rPr>
-              <w:t>0.1529</w:t>
-            </w:r>
-          </w:p>
-        </w:tc>
-        <w:tc>
-          <w:tcPr>
-            <w:tcW w:type="dxa" w:w="1872"/>
-            <w:vAlign w:val="center"/>
-          </w:tcPr>
-          <w:p>
-            <w:pPr>
-              <w:spacing w:after="40"/>
-            </w:pPr>
-            <w:r/>
-            <w:r>
-              <w:rPr>
-                <w:b w:val="0"/>
-                <w:color w:val="000000"/>
-                <w:sz w:val="18"/>
-              </w:rPr>
-              <w:t>42.50%</w:t>
-            </w:r>
-          </w:p>
-        </w:tc>
-        <w:tc>
-          <w:tcPr>
-            <w:tcW w:type="dxa" w:w="1584"/>
-            <w:vAlign w:val="center"/>
-          </w:tcPr>
-          <w:p>
-            <w:pPr>
-              <w:spacing w:after="40"/>
-            </w:pPr>
-            <w:r/>
-            <w:r>
-              <w:rPr>
-                <w:b w:val="0"/>
-                <w:color w:val="000000"/>
-                <w:sz w:val="18"/>
-              </w:rPr>
-              <w:t>13.54%</w:t>
-            </w:r>
-          </w:p>
-        </w:tc>
-        <w:tc>
-          <w:tcPr>
-            <w:tcW w:type="dxa" w:w="1152"/>
-            <w:vAlign w:val="center"/>
-          </w:tcPr>
-          <w:p>
-            <w:pPr>
-              <w:spacing w:after="40"/>
-            </w:pPr>
-            <w:r/>
-            <w:r>
-              <w:rPr>
-                <w:b w:val="0"/>
-                <w:color w:val="000000"/>
-                <w:sz w:val="18"/>
-              </w:rPr>
-              <w:t>1,000</w:t>
-            </w:r>
-          </w:p>
-        </w:tc>
-      </w:tr>
-      <w:tr>
-        <w:tc>
-          <w:tcPr>
-            <w:tcW w:type="dxa" w:w="2304"/>
+            <w:tcW w:type="dxa" w:w="2232"/>
             <w:vAlign w:val="center"/>
             <w:shd w:fill="F3F6F9"/>
           </w:tcPr>
@@ -1496,7 +1318,28 @@
         </w:tc>
         <w:tc>
           <w:tcPr>
-            <w:tcW w:type="dxa" w:w="1872"/>
+            <w:tcW w:type="dxa" w:w="893"/>
+            <w:vAlign w:val="center"/>
+            <w:shd w:fill="F3F6F9"/>
+          </w:tcPr>
+          <w:p>
+            <w:pPr>
+              <w:spacing w:after="40"/>
+            </w:pPr>
+            <w:r/>
+            <w:r>
+              <w:rPr>
+                <w:b w:val="0"/>
+                <w:color w:val="000000"/>
+                <w:sz w:val="18"/>
+              </w:rPr>
+              <w:t>1,000</w:t>
+            </w:r>
+          </w:p>
+        </w:tc>
+        <w:tc>
+          <w:tcPr>
+            <w:tcW w:type="dxa" w:w="1094"/>
             <w:vAlign w:val="center"/>
             <w:shd w:fill="F3F6F9"/>
           </w:tcPr>
@@ -1517,7 +1360,7 @@
         </w:tc>
         <w:tc>
           <w:tcPr>
-            <w:tcW w:type="dxa" w:w="1440"/>
+            <w:tcW w:type="dxa" w:w="1094"/>
             <w:vAlign w:val="center"/>
             <w:shd w:fill="F3F6F9"/>
           </w:tcPr>
@@ -1538,7 +1381,7 @@
         </w:tc>
         <w:tc>
           <w:tcPr>
-            <w:tcW w:type="dxa" w:w="1872"/>
+            <w:tcW w:type="dxa" w:w="1094"/>
             <w:vAlign w:val="center"/>
             <w:shd w:fill="F3F6F9"/>
           </w:tcPr>
@@ -1559,7 +1402,7 @@
         </w:tc>
         <w:tc>
           <w:tcPr>
-            <w:tcW w:type="dxa" w:w="1584"/>
+            <w:tcW w:type="dxa" w:w="1253"/>
             <w:vAlign w:val="center"/>
             <w:shd w:fill="F3F6F9"/>
           </w:tcPr>
@@ -1578,9 +1421,195 @@
             </w:r>
           </w:p>
         </w:tc>
+      </w:tr>
+      <w:tr>
         <w:tc>
           <w:tcPr>
-            <w:tcW w:type="dxa" w:w="1152"/>
+            <w:tcW w:type="dxa" w:w="648"/>
+            <w:vAlign w:val="center"/>
+          </w:tcPr>
+          <w:p>
+            <w:pPr>
+              <w:spacing w:after="40"/>
+            </w:pPr>
+            <w:r/>
+            <w:r>
+              <w:rPr>
+                <w:b w:val="0"/>
+                <w:color w:val="000000"/>
+                <w:sz w:val="18"/>
+              </w:rPr>
+              <w:t>3</w:t>
+            </w:r>
+          </w:p>
+        </w:tc>
+        <w:tc>
+          <w:tcPr>
+            <w:tcW w:type="dxa" w:w="2232"/>
+            <w:vAlign w:val="center"/>
+          </w:tcPr>
+          <w:p>
+            <w:pPr>
+              <w:spacing w:after="40"/>
+            </w:pPr>
+            <w:r/>
+            <w:r>
+              <w:rPr>
+                <w:b w:val="0"/>
+                <w:color w:val="000000"/>
+                <w:sz w:val="18"/>
+              </w:rPr>
+              <w:t>B 逻辑回归</w:t>
+            </w:r>
+          </w:p>
+        </w:tc>
+        <w:tc>
+          <w:tcPr>
+            <w:tcW w:type="dxa" w:w="893"/>
+            <w:vAlign w:val="center"/>
+          </w:tcPr>
+          <w:p>
+            <w:pPr>
+              <w:spacing w:after="40"/>
+            </w:pPr>
+            <w:r/>
+            <w:r>
+              <w:rPr>
+                <w:b w:val="0"/>
+                <w:color w:val="000000"/>
+                <w:sz w:val="18"/>
+              </w:rPr>
+              <w:t>1,000</w:t>
+            </w:r>
+          </w:p>
+        </w:tc>
+        <w:tc>
+          <w:tcPr>
+            <w:tcW w:type="dxa" w:w="1094"/>
+            <w:vAlign w:val="center"/>
+          </w:tcPr>
+          <w:p>
+            <w:pPr>
+              <w:spacing w:after="40"/>
+            </w:pPr>
+            <w:r/>
+            <w:r>
+              <w:rPr>
+                <w:b w:val="0"/>
+                <w:color w:val="000000"/>
+                <w:sz w:val="18"/>
+              </w:rPr>
+              <w:t>21.92%</w:t>
+            </w:r>
+          </w:p>
+        </w:tc>
+        <w:tc>
+          <w:tcPr>
+            <w:tcW w:type="dxa" w:w="1094"/>
+            <w:vAlign w:val="center"/>
+          </w:tcPr>
+          <w:p>
+            <w:pPr>
+              <w:spacing w:after="40"/>
+            </w:pPr>
+            <w:r/>
+            <w:r>
+              <w:rPr>
+                <w:b w:val="0"/>
+                <w:color w:val="000000"/>
+                <w:sz w:val="18"/>
+              </w:rPr>
+              <w:t>0.2371</w:t>
+            </w:r>
+          </w:p>
+        </w:tc>
+        <w:tc>
+          <w:tcPr>
+            <w:tcW w:type="dxa" w:w="1094"/>
+            <w:vAlign w:val="center"/>
+          </w:tcPr>
+          <w:p>
+            <w:pPr>
+              <w:spacing w:after="40"/>
+            </w:pPr>
+            <w:r/>
+            <w:r>
+              <w:rPr>
+                <w:b w:val="0"/>
+                <w:color w:val="000000"/>
+                <w:sz w:val="18"/>
+              </w:rPr>
+              <w:t>54.90%</w:t>
+            </w:r>
+          </w:p>
+        </w:tc>
+        <w:tc>
+          <w:tcPr>
+            <w:tcW w:type="dxa" w:w="1253"/>
+            <w:vAlign w:val="center"/>
+          </w:tcPr>
+          <w:p>
+            <w:pPr>
+              <w:spacing w:after="40"/>
+            </w:pPr>
+            <w:r/>
+            <w:r>
+              <w:rPr>
+                <w:b w:val="0"/>
+                <w:color w:val="000000"/>
+                <w:sz w:val="18"/>
+              </w:rPr>
+              <w:t>21.92%</w:t>
+            </w:r>
+          </w:p>
+        </w:tc>
+      </w:tr>
+      <w:tr>
+        <w:tc>
+          <w:tcPr>
+            <w:tcW w:type="dxa" w:w="648"/>
+            <w:vAlign w:val="center"/>
+            <w:shd w:fill="F3F6F9"/>
+          </w:tcPr>
+          <w:p>
+            <w:pPr>
+              <w:spacing w:after="40"/>
+            </w:pPr>
+            <w:r/>
+            <w:r>
+              <w:rPr>
+                <w:b w:val="0"/>
+                <w:color w:val="000000"/>
+                <w:sz w:val="18"/>
+              </w:rPr>
+              <w:t>4</w:t>
+            </w:r>
+          </w:p>
+        </w:tc>
+        <w:tc>
+          <w:tcPr>
+            <w:tcW w:type="dxa" w:w="2232"/>
+            <w:vAlign w:val="center"/>
+            <w:shd w:fill="F3F6F9"/>
+          </w:tcPr>
+          <w:p>
+            <w:pPr>
+              <w:spacing w:after="40"/>
+            </w:pPr>
+            <w:r/>
+            <w:r>
+              <w:rPr>
+                <w:b w:val="0"/>
+                <w:color w:val="000000"/>
+                <w:sz w:val="18"/>
+              </w:rPr>
+              <w:t>C BGE 语义</w:t>
+            </w:r>
+          </w:p>
+        </w:tc>
+        <w:tc>
+          <w:tcPr>
+            <w:tcW w:type="dxa" w:w="893"/>
             <w:vAlign w:val="center"/>
             <w:shd w:fill="F3F6F9"/>
           </w:tcPr>
@@ -1599,6 +1628,90 @@
             </w:r>
           </w:p>
         </w:tc>
+        <w:tc>
+          <w:tcPr>
+            <w:tcW w:type="dxa" w:w="1094"/>
+            <w:vAlign w:val="center"/>
+            <w:shd w:fill="F3F6F9"/>
+          </w:tcPr>
+          <w:p>
+            <w:pPr>
+              <w:spacing w:after="40"/>
+            </w:pPr>
+            <w:r/>
+            <w:r>
+              <w:rPr>
+                <w:b w:val="0"/>
+                <w:color w:val="000000"/>
+                <w:sz w:val="18"/>
+              </w:rPr>
+              <w:t>13.54%</w:t>
+            </w:r>
+          </w:p>
+        </w:tc>
+        <w:tc>
+          <w:tcPr>
+            <w:tcW w:type="dxa" w:w="1094"/>
+            <w:vAlign w:val="center"/>
+            <w:shd w:fill="F3F6F9"/>
+          </w:tcPr>
+          <w:p>
+            <w:pPr>
+              <w:spacing w:after="40"/>
+            </w:pPr>
+            <w:r/>
+            <w:r>
+              <w:rPr>
+                <w:b w:val="0"/>
+                <w:color w:val="000000"/>
+                <w:sz w:val="18"/>
+              </w:rPr>
+              <w:t>0.1529</w:t>
+            </w:r>
+          </w:p>
+        </w:tc>
+        <w:tc>
+          <w:tcPr>
+            <w:tcW w:type="dxa" w:w="1094"/>
+            <w:vAlign w:val="center"/>
+            <w:shd w:fill="F3F6F9"/>
+          </w:tcPr>
+          <w:p>
+            <w:pPr>
+              <w:spacing w:after="40"/>
+            </w:pPr>
+            <w:r/>
+            <w:r>
+              <w:rPr>
+                <w:b w:val="0"/>
+                <w:color w:val="000000"/>
+                <w:sz w:val="18"/>
+              </w:rPr>
+              <w:t>42.50%</w:t>
+            </w:r>
+          </w:p>
+        </w:tc>
+        <w:tc>
+          <w:tcPr>
+            <w:tcW w:type="dxa" w:w="1253"/>
+            <w:vAlign w:val="center"/>
+            <w:shd w:fill="F3F6F9"/>
+          </w:tcPr>
+          <w:p>
+            <w:pPr>
+              <w:spacing w:after="40"/>
+            </w:pPr>
+            <w:r/>
+            <w:r>
+              <w:rPr>
+                <w:b w:val="0"/>
+                <w:color w:val="000000"/>
+                <w:sz w:val="18"/>
+              </w:rPr>
+              <w:t>13.54%</w:t>
+            </w:r>
+          </w:p>
+        </w:tc>
       </w:tr>
     </w:tbl>
     <w:p>
@@ -1608,7 +1721,7 @@
     </w:p>
     <w:p>
       <w:r>
-        <w:t>在该合成协议下，D 的 coverage@5 高于 22%，但 A 更高，说明该结果不能支持自动替换 A。仓库仍使用“coverage 至少提升 2 个百分点且 NDCG 不下降”的联合门槛；本次没有自动替换系统。</w:t>
+        <w:t>在该合成协议下，A 的四项总体指标均高于 D，因此本 benchmark 不支持自动用 D 替换 A。D 仍可作为带有语义补充的候选路线，但不能把本次合成结果直接表述为 MAL 或真实用户效果。</w:t>
       </w:r>
     </w:p>
     <w:p>
@@ -1695,7 +1808,7 @@
         <w:spacing w:after="60"/>
       </w:pPr>
       <w:r>
-        <w:t>原附件中 234 个 MAL 有效目标和 40 个事后 showcase 的旧输出已从当前发布结果入口移除；其历史提交仍可追溯，但不参与本报告结论。</w:t>
+        <w:t>本报告只引用当前 1,000 条合成测试集的结果；独立人工标注或真实用户离线评测仍需另行建立。</w:t>
       </w:r>
     </w:p>
     <w:sectPr>
@@ -2072,11 +2185,11 @@
     <w:qFormat/>
     <w:rsid w:val="00FC693F"/>
     <w:pPr>
-      <w:spacing w:after="120" w:line="276" w:lineRule="auto"/>
+      <w:spacing w:after="120" w:line="360" w:lineRule="exact"/>
     </w:pPr>
     <w:rPr>
       <w:rFonts w:ascii="Microsoft YaHei" w:hAnsi="Microsoft YaHei" w:eastAsia="Microsoft YaHei"/>
-      <w:sz w:val="21"/>
+      <w:sz w:val="22"/>
     </w:rPr>
   </w:style>
   <w:style w:type="paragraph" w:styleId="Header">
@@ -2142,7 +2255,7 @@
       <w:b/>
       <w:bCs/>
       <w:color w:val="000000"/>
-      <w:sz w:val="30"/>
+      <w:sz w:val="32"/>
       <w:szCs w:val="28"/>
     </w:rPr>
   </w:style>
@@ -2166,7 +2279,7 @@
       <w:b/>
       <w:bCs/>
       <w:color w:val="000000"/>
-      <w:sz w:val="24"/>
+      <w:sz w:val="27"/>
       <w:szCs w:val="26"/>
     </w:rPr>
   </w:style>
@@ -2186,10 +2299,11 @@
       <w:outlineLvl w:val="2"/>
     </w:pPr>
     <w:rPr>
-      <w:rFonts w:asciiTheme="majorHAnsi" w:eastAsiaTheme="majorEastAsia" w:hAnsiTheme="majorHAnsi" w:cstheme="majorBidi"/>
+      <w:rFonts w:asciiTheme="majorHAnsi" w:eastAsiaTheme="majorEastAsia" w:hAnsiTheme="majorHAnsi" w:cstheme="majorBidi" w:ascii="Microsoft YaHei" w:hAnsi="Microsoft YaHei" w:eastAsia="Microsoft YaHei"/>
       <w:b/>
       <w:bCs/>
-      <w:color w:val="4F81BD" w:themeColor="accent1"/>
+      <w:color w:val="000000"/>
+      <w:sz w:val="23"/>
     </w:rPr>
   </w:style>
   <w:style w:type="paragraph" w:styleId="Heading4">

</xml_diff>

<commit_message>
Harden Algorithm 1 synthetic release
</commit_message>
<xml_diff>
--- a/算法1技术路线详细报告_1000合成测试版.docx
+++ b/算法1技术路线详细报告_1000合成测试版.docx
@@ -1735,7 +1735,7 @@
     </w:p>
     <w:p>
       <w:r>
-        <w:t>运行命令：python generate_synthetic_1000.py --output results/synthetic_1000。生成目录包含 testset.jsonl、ground_truth_used.jsonl、predictions.jsonl、per_query_metrics.jsonl、metrics.csv、summary.json 和 testset_manifest.json。</w:t>
+        <w:t>运行命令：python generate_synthetic_1000.py --output results/replay_synthetic_1000；随后执行 python run_checks.py --output results/replay_synthetic_1000 和 python verify_delivery.py。重放写入独立目录，不覆盖发布的 results/synthetic_1000。发布目录包含 testset.jsonl、ground_truth_used.jsonl、predictions.jsonl、per_query_metrics.jsonl、metrics.csv、summary.json 和 testset_manifest.json。</w:t>
       </w:r>
     </w:p>
     <w:p>
@@ -1745,7 +1745,7 @@
     </w:p>
     <w:p>
       <w:r>
-        <w:t>验证命令：python run_checks.py。当前测试覆盖 1,000 条标签、4,000 条方法预测、指标复算、目标自排除、manifest 哈希和离线推荐重放。</w:t>
+        <w:t>验证命令：python run_checks.py --output results/replay_synthetic_1000。当前测试覆盖 1,000 条标签、4,000 条方法预测、指标复算、目标自排除、manifest 哈希和离线推荐重放。</w:t>
       </w:r>
     </w:p>
     <w:p>
@@ -1812,6 +1812,7 @@
       </w:r>
     </w:p>
     <w:sectPr>
+      <w:footerReference w:type="default" r:id="rId9"/>
       <w:pgSz w:w="12240" w:h="15840"/>
       <w:pgMar w:top="1008" w:right="1152" w:bottom="936" w:left="1152" w:header="720" w:footer="720" w:gutter="0"/>
       <w:cols w:space="720"/>
@@ -1819,6 +1820,24 @@
     </w:sectPr>
   </w:body>
 </w:document>
+</file>
+
+<file path=word/footer1.xml><?xml version="1.0" encoding="utf-8"?>
+<w:ftr xmlns:m="http://schemas.openxmlformats.org/officeDocument/2006/math" xmlns:mc="http://schemas.openxmlformats.org/markup-compatibility/2006" xmlns:mo="http://schemas.microsoft.com/office/mac/office/2008/main" xmlns:mv="urn:schemas-microsoft-com:mac:vml" xmlns:o="urn:schemas-microsoft-com:office:office" xmlns:r="http://schemas.openxmlformats.org/officeDocument/2006/relationships" xmlns:v="urn:schemas-microsoft-com:vml" xmlns:w10="urn:schemas-microsoft-com:office:word" xmlns:w14="http://schemas.microsoft.com/office/word/2010/wordml" xmlns:w="http://schemas.openxmlformats.org/wordprocessingml/2006/main" xmlns:wne="http://schemas.microsoft.com/office/word/2006/wordml" xmlns:wp14="http://schemas.microsoft.com/office/word/2010/wordprocessingDrawing" xmlns:wp="http://schemas.openxmlformats.org/drawingml/2006/wordprocessingDrawing" xmlns:wpc="http://schemas.microsoft.com/office/word/2010/wordprocessingCanvas" xmlns:wpg="http://schemas.microsoft.com/office/word/2010/wordprocessingGroup" xmlns:wpi="http://schemas.microsoft.com/office/word/2010/wordprocessingInk" xmlns:wps="http://schemas.microsoft.com/office/word/2010/wordprocessingShape" mc:Ignorable="w14 wp14">
+  <w:p>
+    <w:pPr>
+      <w:pStyle w:val="Footer"/>
+      <w:jc w:val="center"/>
+    </w:pPr>
+    <w:r>
+      <w:fldChar w:fldCharType="begin"/>
+      <w:instrText xml:space="preserve"> PAGE </w:instrText>
+      <w:fldChar w:fldCharType="separate"/>
+      <w:t>1</w:t>
+      <w:fldChar w:fldCharType="end"/>
+    </w:r>
+  </w:p>
+</w:ftr>
 </file>
 
 <file path=word/numbering.xml><?xml version="1.0" encoding="utf-8"?>
@@ -2534,9 +2553,6 @@
     <w:qFormat/>
     <w:rsid w:val="00FC693F"/>
     <w:pPr>
-      <w:pBdr>
-        <w:bottom w:val="single" w:sz="8" w:space="4" w:color="4F81BD" w:themeColor="accent1"/>
-      </w:pBdr>
       <w:spacing w:after="300" w:line="240" w:lineRule="auto"/>
       <w:contextualSpacing/>
     </w:pPr>

</xml_diff>